<commit_message>
Add project documentation and templates for ServiceNow Incident Client Script & UI Policy
- Introduced various templates for the ideation phase, requirement analysis, project design, and solution architecture.
- Added detailed documentation for problem statements, empathy maps, data flow diagrams, user stories, and solution requirements.
- Included performance testing templates and user acceptance testing documentation.
- Documented the project overview, architecture, setup instructions, and testing procedures for the ServiceNow Incident Client Script and UI Policy implementation.
</commit_message>
<xml_diff>
--- a/5. Project Development Phase/User Acceptance Test/User Acceptance Testing FSD.docx
+++ b/5. Project Development Phase/User Acceptance Test/User Acceptance Testing FSD.docx
@@ -1,6 +1,6 @@
 
 <file path=word/document.xml><?xml version="1.0" encoding="utf-8"?>
-<w:document xmlns:wpc="http://schemas.microsoft.com/office/word/2010/wordprocessingCanvas" xmlns:cx="http://schemas.microsoft.com/office/drawing/2014/chartex" xmlns:cx1="http://schemas.microsoft.com/office/drawing/2015/9/8/chartex" xmlns:cx2="http://schemas.microsoft.com/office/drawing/2015/10/21/chartex" xmlns:cx3="http://schemas.microsoft.com/office/drawing/2016/5/9/chartex" xmlns:cx4="http://schemas.microsoft.com/office/drawing/2016/5/10/chartex" xmlns:cx5="http://schemas.microsoft.com/office/drawing/2016/5/11/chartex" xmlns:cx6="http://schemas.microsoft.com/office/drawing/2016/5/12/chartex" xmlns:cx7="http://schemas.microsoft.com/office/drawing/2016/5/13/chartex" xmlns:cx8="http://schemas.microsoft.com/office/drawing/2016/5/14/chartex" xmlns:mc="http://schemas.openxmlformats.org/markup-compatibility/2006" xmlns:aink="http://schemas.microsoft.com/office/drawing/2016/ink" xmlns:am3d="http://schemas.microsoft.com/office/drawing/2017/model3d" xmlns:o="urn:schemas-microsoft-com:office:office" xmlns:oel="http://schemas.microsoft.com/office/2019/extlst" xmlns:r="http://schemas.openxmlformats.org/officeDocument/2006/relationships" xmlns:m="http://schemas.openxmlformats.org/officeDocument/2006/math" xmlns:v="urn:schemas-microsoft-com:vml" xmlns:wp14="http://schemas.microsoft.com/office/word/2010/wordprocessingDrawing" xmlns:wp="http://schemas.openxmlformats.org/drawingml/2006/wordprocessingDrawing" xmlns:w10="urn:schemas-microsoft-com:office:word" xmlns:w="http://schemas.openxmlformats.org/wordprocessingml/2006/main" xmlns:w14="http://schemas.microsoft.com/office/word/2010/wordml" xmlns:w15="http://schemas.microsoft.com/office/word/2012/wordml" xmlns:w16cex="http://schemas.microsoft.com/office/word/2018/wordml/cex" xmlns:w16cid="http://schemas.microsoft.com/office/word/2016/wordml/cid" xmlns:w16="http://schemas.microsoft.com/office/word/2018/wordml" xmlns:w16du="http://schemas.microsoft.com/office/word/2023/wordml/word16du" xmlns:w16sdtdh="http://schemas.microsoft.com/office/word/2020/wordml/sdtdatahash" xmlns:w16se="http://schemas.microsoft.com/office/word/2015/wordml/symex" xmlns:wpg="http://schemas.microsoft.com/office/word/2010/wordprocessingGroup" xmlns:wpi="http://schemas.microsoft.com/office/word/2010/wordprocessingInk" xmlns:wne="http://schemas.microsoft.com/office/word/2006/wordml" xmlns:wps="http://schemas.microsoft.com/office/word/2010/wordprocessingShape" mc:Ignorable="w14 w15 w16se w16cid w16 w16cex w16sdtdh w16du wp14">
+<w:document xmlns:wpc="http://schemas.microsoft.com/office/word/2010/wordprocessingCanvas" xmlns:cx="http://schemas.microsoft.com/office/drawing/2014/chartex" xmlns:cx1="http://schemas.microsoft.com/office/drawing/2015/9/8/chartex" xmlns:cx2="http://schemas.microsoft.com/office/drawing/2015/10/21/chartex" xmlns:cx3="http://schemas.microsoft.com/office/drawing/2016/5/9/chartex" xmlns:cx4="http://schemas.microsoft.com/office/drawing/2016/5/10/chartex" xmlns:cx5="http://schemas.microsoft.com/office/drawing/2016/5/11/chartex" xmlns:cx6="http://schemas.microsoft.com/office/drawing/2016/5/12/chartex" xmlns:cx7="http://schemas.microsoft.com/office/drawing/2016/5/13/chartex" xmlns:cx8="http://schemas.microsoft.com/office/drawing/2016/5/14/chartex" xmlns:mc="http://schemas.openxmlformats.org/markup-compatibility/2006" xmlns:aink="http://schemas.microsoft.com/office/drawing/2016/ink" xmlns:am3d="http://schemas.microsoft.com/office/drawing/2017/model3d" xmlns:o="urn:schemas-microsoft-com:office:office" xmlns:oel="http://schemas.microsoft.com/office/2019/extlst" xmlns:r="http://schemas.openxmlformats.org/officeDocument/2006/relationships" xmlns:m="http://schemas.openxmlformats.org/officeDocument/2006/math" xmlns:v="urn:schemas-microsoft-com:vml" xmlns:wp14="http://schemas.microsoft.com/office/word/2010/wordprocessingDrawing" xmlns:wp="http://schemas.openxmlformats.org/drawingml/2006/wordprocessingDrawing" xmlns:w10="urn:schemas-microsoft-com:office:word" xmlns:w="http://schemas.openxmlformats.org/wordprocessingml/2006/main" xmlns:w14="http://schemas.microsoft.com/office/word/2010/wordml" xmlns:w15="http://schemas.microsoft.com/office/word/2012/wordml" xmlns:w16cex="http://schemas.microsoft.com/office/word/2018/wordml/cex" xmlns:w16cid="http://schemas.microsoft.com/office/word/2016/wordml/cid" xmlns:w16="http://schemas.microsoft.com/office/word/2018/wordml" xmlns:w16du="http://schemas.microsoft.com/office/word/2023/wordml/word16du" xmlns:w16sdtdh="http://schemas.microsoft.com/office/word/2020/wordml/sdtdatahash" xmlns:w16sdtfl="http://schemas.microsoft.com/office/word/2024/wordml/sdtformatlock" xmlns:w16se="http://schemas.microsoft.com/office/word/2015/wordml/symex" xmlns:wpg="http://schemas.microsoft.com/office/word/2010/wordprocessingGroup" xmlns:wpi="http://schemas.microsoft.com/office/word/2010/wordprocessingInk" xmlns:wne="http://schemas.microsoft.com/office/word/2006/wordml" xmlns:wps="http://schemas.microsoft.com/office/word/2010/wordprocessingShape" mc:Ignorable="w14 w15 w16se w16cid w16 w16cex w16sdtdh w16sdtfl w16du wp14">
   <w:body>
     <w:p>
       <w:pPr>
@@ -99,13 +99,8 @@
             <w:hideMark/>
           </w:tcPr>
           <w:p>
-            <w:pPr>
-              <w:jc w:val="left"/>
-            </w:pPr>
-            <w:r/>
-            <w:r>
-              <w:rPr>
-                <w:b w:val="0"/>
+            <w:r>
+              <w:rPr>
                 <w:sz w:val="18"/>
               </w:rPr>
               <w:t>03 October 2026</w:t>
@@ -174,13 +169,8 @@
             <w:hideMark/>
           </w:tcPr>
           <w:p>
-            <w:pPr>
-              <w:jc w:val="left"/>
-            </w:pPr>
-            <w:r/>
-            <w:r>
-              <w:rPr>
-                <w:b w:val="0"/>
+            <w:r>
+              <w:rPr>
                 <w:sz w:val="18"/>
               </w:rPr>
               <w:t>SWTID-2026-2035</w:t>
@@ -249,13 +239,8 @@
             <w:hideMark/>
           </w:tcPr>
           <w:p>
-            <w:pPr>
-              <w:jc w:val="left"/>
-            </w:pPr>
-            <w:r/>
-            <w:r>
-              <w:rPr>
-                <w:b w:val="0"/>
+            <w:r>
+              <w:rPr>
                 <w:sz w:val="18"/>
               </w:rPr>
               <w:t>Implement Client Script &amp; UI Policy (Incident)</w:t>
@@ -324,13 +309,8 @@
             <w:hideMark/>
           </w:tcPr>
           <w:p>
-            <w:pPr>
-              <w:jc w:val="left"/>
-            </w:pPr>
-            <w:r/>
-            <w:r>
-              <w:rPr>
-                <w:b w:val="0"/>
+            <w:r>
+              <w:rPr>
                 <w:sz w:val="18"/>
               </w:rPr>
               <w:t>4 Marks</w:t>
@@ -467,12 +447,12 @@
       </w:tblGrid>
       <w:tr>
         <w:trPr>
-          <w:tblHeader w:val="true"/>
+          <w:tblHeader/>
         </w:trPr>
         <w:tc>
           <w:tcPr>
             <w:tcW w:w="1285" w:type="dxa"/>
-            <w:shd w:fill="D9EAF7"/>
+            <w:shd w:val="clear" w:color="auto" w:fill="D9EAF7"/>
           </w:tcPr>
           <w:p>
             <w:pPr>
@@ -494,7 +474,7 @@
         <w:tc>
           <w:tcPr>
             <w:tcW w:w="1285" w:type="dxa"/>
-            <w:shd w:fill="D9EAF7"/>
+            <w:shd w:val="clear" w:color="auto" w:fill="D9EAF7"/>
           </w:tcPr>
           <w:p>
             <w:pPr>
@@ -516,7 +496,7 @@
         <w:tc>
           <w:tcPr>
             <w:tcW w:w="2245" w:type="dxa"/>
-            <w:shd w:fill="D9EAF7"/>
+            <w:shd w:val="clear" w:color="auto" w:fill="D9EAF7"/>
           </w:tcPr>
           <w:p>
             <w:pPr>
@@ -538,7 +518,7 @@
         <w:tc>
           <w:tcPr>
             <w:tcW w:w="1276" w:type="dxa"/>
-            <w:shd w:fill="D9EAF7"/>
+            <w:shd w:val="clear" w:color="auto" w:fill="D9EAF7"/>
           </w:tcPr>
           <w:p>
             <w:pPr>
@@ -560,7 +540,7 @@
         <w:tc>
           <w:tcPr>
             <w:tcW w:w="1275" w:type="dxa"/>
-            <w:shd w:fill="D9EAF7"/>
+            <w:shd w:val="clear" w:color="auto" w:fill="D9EAF7"/>
           </w:tcPr>
           <w:p>
             <w:pPr>
@@ -582,7 +562,7 @@
         <w:tc>
           <w:tcPr>
             <w:tcW w:w="1276" w:type="dxa"/>
-            <w:shd w:fill="D9EAF7"/>
+            <w:shd w:val="clear" w:color="auto" w:fill="D9EAF7"/>
           </w:tcPr>
           <w:p>
             <w:pPr>
@@ -609,13 +589,8 @@
             <w:vAlign w:val="center"/>
           </w:tcPr>
           <w:p>
-            <w:pPr>
-              <w:jc w:val="left"/>
-            </w:pPr>
-            <w:r/>
-            <w:r>
-              <w:rPr>
-                <w:b w:val="0"/>
+            <w:r>
+              <w:rPr>
                 <w:sz w:val="18"/>
               </w:rPr>
               <w:t>TC-001</w:t>
@@ -628,13 +603,8 @@
             <w:vAlign w:val="center"/>
           </w:tcPr>
           <w:p>
-            <w:pPr>
-              <w:jc w:val="left"/>
-            </w:pPr>
-            <w:r/>
-            <w:r>
-              <w:rPr>
-                <w:b w:val="0"/>
+            <w:r>
+              <w:rPr>
                 <w:sz w:val="18"/>
               </w:rPr>
               <w:t>Client Script behavior on Incident form</w:t>
@@ -647,18 +617,23 @@
             <w:vAlign w:val="center"/>
           </w:tcPr>
           <w:p>
-            <w:pPr>
-              <w:jc w:val="left"/>
-            </w:pPr>
-            <w:r/>
-            <w:r>
-              <w:rPr>
-                <w:b w:val="0"/>
+            <w:r>
+              <w:rPr>
                 <w:sz w:val="18"/>
               </w:rPr>
               <w:t>1. Open an Incident form.</w:t>
+            </w:r>
+            <w:r>
+              <w:rPr>
+                <w:sz w:val="18"/>
+              </w:rPr>
               <w:br/>
               <w:t>2. Enter/change the fields required to trigger the Client Script.</w:t>
+            </w:r>
+            <w:r>
+              <w:rPr>
+                <w:sz w:val="18"/>
+              </w:rPr>
               <w:br/>
               <w:t>3. Observe the configured field behavior.</w:t>
             </w:r>
@@ -670,13 +645,8 @@
             <w:vAlign w:val="center"/>
           </w:tcPr>
           <w:p>
-            <w:pPr>
-              <w:jc w:val="left"/>
-            </w:pPr>
-            <w:r/>
-            <w:r>
-              <w:rPr>
-                <w:b w:val="0"/>
+            <w:r>
+              <w:rPr>
                 <w:sz w:val="18"/>
               </w:rPr>
               <w:t>Configured client-side behavior is applied immediately when the trigger condition is met.</w:t>
@@ -689,13 +659,8 @@
             <w:vAlign w:val="center"/>
           </w:tcPr>
           <w:p>
-            <w:pPr>
-              <w:jc w:val="left"/>
-            </w:pPr>
-            <w:r/>
-            <w:r>
-              <w:rPr>
-                <w:b w:val="0"/>
+            <w:r>
+              <w:rPr>
                 <w:sz w:val="18"/>
               </w:rPr>
               <w:t>Passed – configured Client Script behavior was observed on the Incident form.</w:t>
@@ -708,13 +673,8 @@
             <w:vAlign w:val="center"/>
           </w:tcPr>
           <w:p>
-            <w:pPr>
-              <w:jc w:val="left"/>
-            </w:pPr>
-            <w:r/>
-            <w:r>
-              <w:rPr>
-                <w:b w:val="0"/>
+            <w:r>
+              <w:rPr>
                 <w:sz w:val="18"/>
               </w:rPr>
               <w:t>Pass</w:t>
@@ -729,13 +689,8 @@
             <w:vAlign w:val="center"/>
           </w:tcPr>
           <w:p>
-            <w:pPr>
-              <w:jc w:val="left"/>
-            </w:pPr>
-            <w:r/>
-            <w:r>
-              <w:rPr>
-                <w:b w:val="0"/>
+            <w:r>
+              <w:rPr>
                 <w:sz w:val="18"/>
               </w:rPr>
               <w:t>TC-002</w:t>
@@ -748,13 +703,8 @@
             <w:vAlign w:val="center"/>
           </w:tcPr>
           <w:p>
-            <w:pPr>
-              <w:jc w:val="left"/>
-            </w:pPr>
-            <w:r/>
-            <w:r>
-              <w:rPr>
-                <w:b w:val="0"/>
+            <w:r>
+              <w:rPr>
                 <w:sz w:val="18"/>
               </w:rPr>
               <w:t>UI Policy behavior on Incident form</w:t>
@@ -767,18 +717,23 @@
             <w:vAlign w:val="center"/>
           </w:tcPr>
           <w:p>
-            <w:pPr>
-              <w:jc w:val="left"/>
-            </w:pPr>
-            <w:r/>
-            <w:r>
-              <w:rPr>
-                <w:b w:val="0"/>
+            <w:r>
+              <w:rPr>
                 <w:sz w:val="18"/>
               </w:rPr>
               <w:t>1. Open an Incident form.</w:t>
+            </w:r>
+            <w:r>
+              <w:rPr>
+                <w:sz w:val="18"/>
+              </w:rPr>
               <w:br/>
               <w:t>2. Change the condition/state used by the UI Policy.</w:t>
+            </w:r>
+            <w:r>
+              <w:rPr>
+                <w:sz w:val="18"/>
+              </w:rPr>
               <w:br/>
               <w:t>3. Verify affected fields.</w:t>
             </w:r>
@@ -790,13 +745,8 @@
             <w:vAlign w:val="center"/>
           </w:tcPr>
           <w:p>
-            <w:pPr>
-              <w:jc w:val="left"/>
-            </w:pPr>
-            <w:r/>
-            <w:r>
-              <w:rPr>
-                <w:b w:val="0"/>
+            <w:r>
+              <w:rPr>
                 <w:sz w:val="18"/>
               </w:rPr>
               <w:t>Configured field visibility, mandatory, or read-only behavior changes according to the UI Policy.</w:t>
@@ -809,13 +759,8 @@
             <w:vAlign w:val="center"/>
           </w:tcPr>
           <w:p>
-            <w:pPr>
-              <w:jc w:val="left"/>
-            </w:pPr>
-            <w:r/>
-            <w:r>
-              <w:rPr>
-                <w:b w:val="0"/>
+            <w:r>
+              <w:rPr>
                 <w:sz w:val="18"/>
               </w:rPr>
               <w:t>Passed – UI Policy applied the configured field behavior as expected.</w:t>
@@ -828,13 +773,8 @@
             <w:vAlign w:val="center"/>
           </w:tcPr>
           <w:p>
-            <w:pPr>
-              <w:jc w:val="left"/>
-            </w:pPr>
-            <w:r/>
-            <w:r>
-              <w:rPr>
-                <w:b w:val="0"/>
+            <w:r>
+              <w:rPr>
                 <w:sz w:val="18"/>
               </w:rPr>
               <w:t>Pass</w:t>
@@ -858,11 +798,108 @@
           <w:bCs/>
         </w:rPr>
       </w:pPr>
+    </w:p>
+    <w:p>
+      <w:pPr>
+        <w:rPr>
+          <w:b/>
+          <w:bCs/>
+        </w:rPr>
+      </w:pPr>
+    </w:p>
+    <w:p>
+      <w:pPr>
+        <w:rPr>
+          <w:b/>
+          <w:bCs/>
+        </w:rPr>
+      </w:pPr>
+    </w:p>
+    <w:p>
+      <w:pPr>
+        <w:rPr>
+          <w:b/>
+          <w:bCs/>
+        </w:rPr>
+      </w:pPr>
+    </w:p>
+    <w:p>
+      <w:pPr>
+        <w:rPr>
+          <w:b/>
+          <w:bCs/>
+        </w:rPr>
+      </w:pPr>
+    </w:p>
+    <w:p>
+      <w:pPr>
+        <w:rPr>
+          <w:b/>
+          <w:bCs/>
+        </w:rPr>
+      </w:pPr>
+    </w:p>
+    <w:p>
+      <w:pPr>
+        <w:rPr>
+          <w:b/>
+          <w:bCs/>
+        </w:rPr>
+      </w:pPr>
+    </w:p>
+    <w:p>
+      <w:pPr>
+        <w:rPr>
+          <w:b/>
+          <w:bCs/>
+        </w:rPr>
+      </w:pPr>
+    </w:p>
+    <w:p>
+      <w:pPr>
+        <w:rPr>
+          <w:b/>
+          <w:bCs/>
+        </w:rPr>
+      </w:pPr>
+    </w:p>
+    <w:p>
+      <w:pPr>
+        <w:rPr>
+          <w:b/>
+          <w:bCs/>
+        </w:rPr>
+      </w:pPr>
+    </w:p>
+    <w:p>
+      <w:pPr>
+        <w:rPr>
+          <w:b/>
+          <w:bCs/>
+        </w:rPr>
+      </w:pPr>
+    </w:p>
+    <w:p>
+      <w:pPr>
+        <w:rPr>
+          <w:b/>
+          <w:bCs/>
+        </w:rPr>
+      </w:pPr>
+    </w:p>
+    <w:p>
+      <w:pPr>
+        <w:rPr>
+          <w:b/>
+          <w:bCs/>
+        </w:rPr>
+      </w:pPr>
       <w:r>
         <w:rPr>
           <w:b/>
           <w:bCs/>
         </w:rPr>
+        <w:lastRenderedPageBreak/>
         <w:t>Bug Tracking:</w:t>
       </w:r>
     </w:p>
@@ -885,12 +922,12 @@
       <w:tr>
         <w:trPr>
           <w:trHeight w:val="841"/>
-          <w:tblHeader w:val="true"/>
+          <w:tblHeader/>
         </w:trPr>
         <w:tc>
           <w:tcPr>
             <w:tcW w:w="1129" w:type="dxa"/>
-            <w:shd w:fill="D9EAF7"/>
+            <w:shd w:val="clear" w:color="auto" w:fill="D9EAF7"/>
           </w:tcPr>
           <w:p>
             <w:pPr>
@@ -912,7 +949,7 @@
         <w:tc>
           <w:tcPr>
             <w:tcW w:w="1441" w:type="dxa"/>
-            <w:shd w:fill="D9EAF7"/>
+            <w:shd w:val="clear" w:color="auto" w:fill="D9EAF7"/>
           </w:tcPr>
           <w:p>
             <w:pPr>
@@ -934,7 +971,7 @@
         <w:tc>
           <w:tcPr>
             <w:tcW w:w="2245" w:type="dxa"/>
-            <w:shd w:fill="D9EAF7"/>
+            <w:shd w:val="clear" w:color="auto" w:fill="D9EAF7"/>
           </w:tcPr>
           <w:p>
             <w:pPr>
@@ -963,7 +1000,7 @@
         <w:tc>
           <w:tcPr>
             <w:tcW w:w="1276" w:type="dxa"/>
-            <w:shd w:fill="D9EAF7"/>
+            <w:shd w:val="clear" w:color="auto" w:fill="D9EAF7"/>
           </w:tcPr>
           <w:p>
             <w:pPr>
@@ -985,7 +1022,7 @@
         <w:tc>
           <w:tcPr>
             <w:tcW w:w="1134" w:type="dxa"/>
-            <w:shd w:fill="D9EAF7"/>
+            <w:shd w:val="clear" w:color="auto" w:fill="D9EAF7"/>
           </w:tcPr>
           <w:p>
             <w:pPr>
@@ -1007,7 +1044,7 @@
         <w:tc>
           <w:tcPr>
             <w:tcW w:w="1417" w:type="dxa"/>
-            <w:shd w:fill="D9EAF7"/>
+            <w:shd w:val="clear" w:color="auto" w:fill="D9EAF7"/>
           </w:tcPr>
           <w:p>
             <w:pPr>
@@ -1034,13 +1071,8 @@
             <w:vAlign w:val="center"/>
           </w:tcPr>
           <w:p>
-            <w:pPr>
-              <w:jc w:val="left"/>
-            </w:pPr>
-            <w:r/>
-            <w:r>
-              <w:rPr>
-                <w:b w:val="0"/>
+            <w:r>
+              <w:rPr>
                 <w:sz w:val="18"/>
               </w:rPr>
               <w:t>BG-001</w:t>
@@ -1053,13 +1085,8 @@
             <w:vAlign w:val="center"/>
           </w:tcPr>
           <w:p>
-            <w:pPr>
-              <w:jc w:val="left"/>
-            </w:pPr>
-            <w:r/>
-            <w:r>
-              <w:rPr>
-                <w:b w:val="0"/>
+            <w:r>
+              <w:rPr>
                 <w:sz w:val="18"/>
               </w:rPr>
               <w:t>No functional defect observed during UAT execution.</w:t>
@@ -1072,13 +1099,8 @@
             <w:vAlign w:val="center"/>
           </w:tcPr>
           <w:p>
-            <w:pPr>
-              <w:jc w:val="left"/>
-            </w:pPr>
-            <w:r/>
-            <w:r>
-              <w:rPr>
-                <w:b w:val="0"/>
+            <w:r>
+              <w:rPr>
                 <w:sz w:val="18"/>
               </w:rPr>
               <w:t>Execute TC-001 and TC-002 and verify configured Client Script/UI Policy behavior.</w:t>
@@ -1091,13 +1113,8 @@
             <w:vAlign w:val="center"/>
           </w:tcPr>
           <w:p>
-            <w:pPr>
-              <w:jc w:val="left"/>
-            </w:pPr>
-            <w:r/>
-            <w:r>
-              <w:rPr>
-                <w:b w:val="0"/>
+            <w:r>
+              <w:rPr>
                 <w:sz w:val="18"/>
               </w:rPr>
               <w:t>Low</w:t>
@@ -1110,13 +1127,8 @@
             <w:vAlign w:val="center"/>
           </w:tcPr>
           <w:p>
-            <w:pPr>
-              <w:jc w:val="left"/>
-            </w:pPr>
-            <w:r/>
-            <w:r>
-              <w:rPr>
-                <w:b w:val="0"/>
+            <w:r>
+              <w:rPr>
                 <w:sz w:val="18"/>
               </w:rPr>
               <w:t>Closed</w:t>
@@ -1129,13 +1141,8 @@
             <w:vAlign w:val="center"/>
           </w:tcPr>
           <w:p>
-            <w:pPr>
-              <w:jc w:val="left"/>
-            </w:pPr>
-            <w:r/>
-            <w:r>
-              <w:rPr>
-                <w:b w:val="0"/>
+            <w:r>
+              <w:rPr>
                 <w:sz w:val="18"/>
               </w:rPr>
               <w:t>No additional feedback; behavior matched the configured requirements.</w:t>
@@ -1159,7 +1166,6 @@
               <w:rPr>
                 <w:color w:val="1F1F1F"/>
               </w:rPr>
-              <w:lastRenderedPageBreak/>
               <w:t>...</w:t>
             </w:r>
           </w:p>
@@ -1269,6 +1275,70 @@
           <w:bCs/>
         </w:rPr>
       </w:pPr>
+    </w:p>
+    <w:p>
+      <w:pPr>
+        <w:rPr>
+          <w:b/>
+          <w:bCs/>
+        </w:rPr>
+      </w:pPr>
+    </w:p>
+    <w:p>
+      <w:pPr>
+        <w:rPr>
+          <w:b/>
+          <w:bCs/>
+        </w:rPr>
+      </w:pPr>
+    </w:p>
+    <w:p>
+      <w:pPr>
+        <w:rPr>
+          <w:b/>
+          <w:bCs/>
+        </w:rPr>
+      </w:pPr>
+    </w:p>
+    <w:p>
+      <w:pPr>
+        <w:rPr>
+          <w:b/>
+          <w:bCs/>
+        </w:rPr>
+      </w:pPr>
+    </w:p>
+    <w:p>
+      <w:pPr>
+        <w:rPr>
+          <w:b/>
+          <w:bCs/>
+        </w:rPr>
+      </w:pPr>
+    </w:p>
+    <w:p>
+      <w:pPr>
+        <w:rPr>
+          <w:b/>
+          <w:bCs/>
+        </w:rPr>
+      </w:pPr>
+    </w:p>
+    <w:p>
+      <w:pPr>
+        <w:rPr>
+          <w:b/>
+          <w:bCs/>
+        </w:rPr>
+      </w:pPr>
+    </w:p>
+    <w:p>
+      <w:pPr>
+        <w:rPr>
+          <w:b/>
+          <w:bCs/>
+        </w:rPr>
+      </w:pPr>
       <w:r>
         <w:rPr>
           <w:b/>
@@ -1279,7 +1349,10 @@
     </w:p>
     <w:p>
       <w:r>
-        <w:t>Tester Name: Project Team</w:t>
+        <w:t xml:space="preserve">Tester Name: </w:t>
+      </w:r>
+      <w:r>
+        <w:t>Shiva Prakash</w:t>
       </w:r>
     </w:p>
     <w:p>
@@ -1291,6 +1364,14 @@
       <w:r>
         <w:t>Signature: ____________________</w:t>
       </w:r>
+    </w:p>
+    <w:p>
+      <w:pPr>
+        <w:rPr>
+          <w:b/>
+          <w:bCs/>
+        </w:rPr>
+      </w:pPr>
     </w:p>
     <w:p>
       <w:pPr>
@@ -1367,7 +1448,7 @@
 </file>
 
 <file path=word/numbering.xml><?xml version="1.0" encoding="utf-8"?>
-<w:numbering xmlns:wpc="http://schemas.microsoft.com/office/word/2010/wordprocessingCanvas" xmlns:cx="http://schemas.microsoft.com/office/drawing/2014/chartex" xmlns:cx1="http://schemas.microsoft.com/office/drawing/2015/9/8/chartex" xmlns:cx2="http://schemas.microsoft.com/office/drawing/2015/10/21/chartex" xmlns:cx3="http://schemas.microsoft.com/office/drawing/2016/5/9/chartex" xmlns:cx4="http://schemas.microsoft.com/office/drawing/2016/5/10/chartex" xmlns:cx5="http://schemas.microsoft.com/office/drawing/2016/5/11/chartex" xmlns:cx6="http://schemas.microsoft.com/office/drawing/2016/5/12/chartex" xmlns:cx7="http://schemas.microsoft.com/office/drawing/2016/5/13/chartex" xmlns:cx8="http://schemas.microsoft.com/office/drawing/2016/5/14/chartex" xmlns:mc="http://schemas.openxmlformats.org/markup-compatibility/2006" xmlns:aink="http://schemas.microsoft.com/office/drawing/2016/ink" xmlns:am3d="http://schemas.microsoft.com/office/drawing/2017/model3d" xmlns:o="urn:schemas-microsoft-com:office:office" xmlns:oel="http://schemas.microsoft.com/office/2019/extlst" xmlns:r="http://schemas.openxmlformats.org/officeDocument/2006/relationships" xmlns:m="http://schemas.openxmlformats.org/officeDocument/2006/math" xmlns:v="urn:schemas-microsoft-com:vml" xmlns:wp14="http://schemas.microsoft.com/office/word/2010/wordprocessingDrawing" xmlns:wp="http://schemas.openxmlformats.org/drawingml/2006/wordprocessingDrawing" xmlns:w10="urn:schemas-microsoft-com:office:word" xmlns:w="http://schemas.openxmlformats.org/wordprocessingml/2006/main" xmlns:w14="http://schemas.microsoft.com/office/word/2010/wordml" xmlns:w15="http://schemas.microsoft.com/office/word/2012/wordml" xmlns:w16cex="http://schemas.microsoft.com/office/word/2018/wordml/cex" xmlns:w16cid="http://schemas.microsoft.com/office/word/2016/wordml/cid" xmlns:w16="http://schemas.microsoft.com/office/word/2018/wordml" xmlns:w16du="http://schemas.microsoft.com/office/word/2023/wordml/word16du" xmlns:w16sdtdh="http://schemas.microsoft.com/office/word/2020/wordml/sdtdatahash" xmlns:w16se="http://schemas.microsoft.com/office/word/2015/wordml/symex" xmlns:wpg="http://schemas.microsoft.com/office/word/2010/wordprocessingGroup" xmlns:wpi="http://schemas.microsoft.com/office/word/2010/wordprocessingInk" xmlns:wne="http://schemas.microsoft.com/office/word/2006/wordml" xmlns:wps="http://schemas.microsoft.com/office/word/2010/wordprocessingShape" mc:Ignorable="w14 w15 w16se w16cid w16 w16cex w16sdtdh w16du wp14">
+<w:numbering xmlns:wpc="http://schemas.microsoft.com/office/word/2010/wordprocessingCanvas" xmlns:cx="http://schemas.microsoft.com/office/drawing/2014/chartex" xmlns:cx1="http://schemas.microsoft.com/office/drawing/2015/9/8/chartex" xmlns:cx2="http://schemas.microsoft.com/office/drawing/2015/10/21/chartex" xmlns:cx3="http://schemas.microsoft.com/office/drawing/2016/5/9/chartex" xmlns:cx4="http://schemas.microsoft.com/office/drawing/2016/5/10/chartex" xmlns:cx5="http://schemas.microsoft.com/office/drawing/2016/5/11/chartex" xmlns:cx6="http://schemas.microsoft.com/office/drawing/2016/5/12/chartex" xmlns:cx7="http://schemas.microsoft.com/office/drawing/2016/5/13/chartex" xmlns:cx8="http://schemas.microsoft.com/office/drawing/2016/5/14/chartex" xmlns:mc="http://schemas.openxmlformats.org/markup-compatibility/2006" xmlns:aink="http://schemas.microsoft.com/office/drawing/2016/ink" xmlns:am3d="http://schemas.microsoft.com/office/drawing/2017/model3d" xmlns:o="urn:schemas-microsoft-com:office:office" xmlns:oel="http://schemas.microsoft.com/office/2019/extlst" xmlns:r="http://schemas.openxmlformats.org/officeDocument/2006/relationships" xmlns:m="http://schemas.openxmlformats.org/officeDocument/2006/math" xmlns:v="urn:schemas-microsoft-com:vml" xmlns:wp14="http://schemas.microsoft.com/office/word/2010/wordprocessingDrawing" xmlns:wp="http://schemas.openxmlformats.org/drawingml/2006/wordprocessingDrawing" xmlns:w10="urn:schemas-microsoft-com:office:word" xmlns:w="http://schemas.openxmlformats.org/wordprocessingml/2006/main" xmlns:w14="http://schemas.microsoft.com/office/word/2010/wordml" xmlns:w15="http://schemas.microsoft.com/office/word/2012/wordml" xmlns:w16cex="http://schemas.microsoft.com/office/word/2018/wordml/cex" xmlns:w16cid="http://schemas.microsoft.com/office/word/2016/wordml/cid" xmlns:w16="http://schemas.microsoft.com/office/word/2018/wordml" xmlns:w16du="http://schemas.microsoft.com/office/word/2023/wordml/word16du" xmlns:w16sdtdh="http://schemas.microsoft.com/office/word/2020/wordml/sdtdatahash" xmlns:w16sdtfl="http://schemas.microsoft.com/office/word/2024/wordml/sdtformatlock" xmlns:w16se="http://schemas.microsoft.com/office/word/2015/wordml/symex" xmlns:wpg="http://schemas.microsoft.com/office/word/2010/wordprocessingGroup" xmlns:wpi="http://schemas.microsoft.com/office/word/2010/wordprocessingInk" xmlns:wne="http://schemas.microsoft.com/office/word/2006/wordml" xmlns:wps="http://schemas.microsoft.com/office/word/2010/wordprocessingShape" mc:Ignorable="w14 w15 w16se w16cid w16 w16cex w16sdtdh w16sdtfl w16du wp14">
   <w:abstractNum w:abstractNumId="0" w15:restartNumberingAfterBreak="0">
     <w:nsid w:val="13AD7522"/>
     <w:multiLevelType w:val="hybridMultilevel"/>
@@ -1488,7 +1569,7 @@
 </file>
 
 <file path=word/styles.xml><?xml version="1.0" encoding="utf-8"?>
-<w:styles xmlns:mc="http://schemas.openxmlformats.org/markup-compatibility/2006" xmlns:r="http://schemas.openxmlformats.org/officeDocument/2006/relationships" xmlns:w="http://schemas.openxmlformats.org/wordprocessingml/2006/main" xmlns:w14="http://schemas.microsoft.com/office/word/2010/wordml" xmlns:w15="http://schemas.microsoft.com/office/word/2012/wordml" xmlns:w16cex="http://schemas.microsoft.com/office/word/2018/wordml/cex" xmlns:w16cid="http://schemas.microsoft.com/office/word/2016/wordml/cid" xmlns:w16="http://schemas.microsoft.com/office/word/2018/wordml" xmlns:w16du="http://schemas.microsoft.com/office/word/2023/wordml/word16du" xmlns:w16sdtdh="http://schemas.microsoft.com/office/word/2020/wordml/sdtdatahash" xmlns:w16se="http://schemas.microsoft.com/office/word/2015/wordml/symex" mc:Ignorable="w14 w15 w16se w16cid w16 w16cex w16sdtdh w16du">
+<w:styles xmlns:mc="http://schemas.openxmlformats.org/markup-compatibility/2006" xmlns:r="http://schemas.openxmlformats.org/officeDocument/2006/relationships" xmlns:w="http://schemas.openxmlformats.org/wordprocessingml/2006/main" xmlns:w14="http://schemas.microsoft.com/office/word/2010/wordml" xmlns:w15="http://schemas.microsoft.com/office/word/2012/wordml" xmlns:w16cex="http://schemas.microsoft.com/office/word/2018/wordml/cex" xmlns:w16cid="http://schemas.microsoft.com/office/word/2016/wordml/cid" xmlns:w16="http://schemas.microsoft.com/office/word/2018/wordml" xmlns:w16du="http://schemas.microsoft.com/office/word/2023/wordml/word16du" xmlns:w16sdtdh="http://schemas.microsoft.com/office/word/2020/wordml/sdtdatahash" xmlns:w16sdtfl="http://schemas.microsoft.com/office/word/2024/wordml/sdtformatlock" xmlns:w16se="http://schemas.microsoft.com/office/word/2015/wordml/symex" mc:Ignorable="w14 w15 w16se w16cid w16 w16cex w16sdtdh w16sdtfl w16du">
   <w:docDefaults>
     <w:rPrDefault>
       <w:rPr>

</xml_diff>